<commit_message>
Publish updated Emaar study: add 'Valuation summary — every read at a glance' section (docx+PDF); bump file tokens v=0107b and site cache-bust v=20260701e
</commit_message>
<xml_diff>
--- a/files/Emaar_Valuation_Study_01-07-2026_public.docx
+++ b/files/Emaar_Valuation_Study_01-07-2026_public.docx
@@ -1523,6 +1523,1946 @@
           <w:szCs w:val="15"/>
         </w:rPr>
         <w:t xml:space="preserve">Company-level figures are sourced from Emaar's public disclosure (Emaar IR / DFM filings) and other public sources; forward-looking inputs — the recurring mark, the NAV discount, the 2026e–2030e projections, the multiples, the DCF and the Monte-Carlo factor probabilities — are the preparer's derived estimates, not company disclosure, and are flagged throughout.</w:t>
+      </w:r>
+    </w:p>
+    <w:p>
+      <w:pPr>
+        <w:keepNext/>
+        <w:spacing w:after="120" w:before="220"/>
+      </w:pPr>
+      <w:r>
+        <w:rPr>
+          <w:rFonts w:ascii="Calibri" w:cs="Calibri" w:eastAsia="Calibri" w:hAnsi="Calibri"/>
+          <w:b/>
+          <w:bCs/>
+          <w:color w:val="1B5E5E"/>
+          <w:sz w:val="26"/>
+          <w:szCs w:val="26"/>
+        </w:rPr>
+        <w:t xml:space="preserve">Valuation summary — every read at a glance</w:t>
+      </w:r>
+    </w:p>
+    <w:p>
+      <w:pPr>
+        <w:spacing w:after="120" w:before="0" w:line="264"/>
+      </w:pPr>
+      <w:r>
+        <w:rPr>
+          <w:rFonts w:ascii="Calibri" w:cs="Calibri" w:eastAsia="Calibri" w:hAnsi="Calibri"/>
+          <w:b w:val="false"/>
+          <w:bCs w:val="false"/>
+          <w:i w:val="false"/>
+          <w:iCs w:val="false"/>
+          <w:color w:val="222222"/>
+          <w:sz w:val="20"/>
+          <w:szCs w:val="20"/>
+        </w:rPr>
+        <w:t xml:space="preserve">One table for the four reads that follow — what the operating businesses and marked assets are worth (fundamental), what the tape is doing (technical), where price could travel over three months (Monte Carlo), and how three independent expert methods land. Every row is developed in the sections and appendices below.</w:t>
+      </w:r>
+    </w:p>
+    <w:tbl>
+      <w:tblPr>
+        <w:tblW w:type="dxa" w:w="9360"/>
+        <w:tblBorders>
+          <w:top w:val="single" w:color="BFD4D4" w:sz="4"/>
+          <w:left w:val="none" w:color="FFFFFF" w:sz="0"/>
+          <w:bottom w:val="single" w:color="BFD4D4" w:sz="4"/>
+          <w:right w:val="none" w:color="FFFFFF" w:sz="0"/>
+          <w:insideH w:val="single" w:color="D8E6E6" w:sz="4"/>
+          <w:insideV w:val="none" w:color="FFFFFF" w:sz="0"/>
+        </w:tblBorders>
+      </w:tblPr>
+      <w:tblGrid>
+        <w:gridCol w:w="2680"/>
+        <w:gridCol w:w="3320"/>
+        <w:gridCol w:w="1260"/>
+        <w:gridCol w:w="2100"/>
+      </w:tblGrid>
+      <w:tr>
+        <w:trPr>
+          <w:tblHeader/>
+        </w:trPr>
+        <w:tc>
+          <w:tcPr>
+            <w:shd w:fill="B0894B" w:val="clear"/>
+            <w:tcMar>
+              <w:top w:type="dxa" w:w="40"/>
+              <w:left w:type="dxa" w:w="80"/>
+              <w:bottom w:type="dxa" w:w="40"/>
+              <w:right w:type="dxa" w:w="80"/>
+            </w:tcMar>
+            <w:vAlign w:val="center"/>
+          </w:tcPr>
+          <w:p>
+            <w:pPr>
+              <w:spacing w:after="0" w:line="230"/>
+              <w:jc w:val="left"/>
+            </w:pPr>
+            <w:r>
+              <w:rPr>
+                <w:rFonts w:ascii="Calibri" w:cs="Calibri" w:eastAsia="Calibri" w:hAnsi="Calibri"/>
+                <w:b/>
+                <w:bCs/>
+                <w:color w:val="FFFFFF"/>
+                <w:sz w:val="17"/>
+                <w:szCs w:val="17"/>
+              </w:rPr>
+              <w:t xml:space="preserve">Lens / read</w:t>
+            </w:r>
+          </w:p>
+        </w:tc>
+        <w:tc>
+          <w:tcPr>
+            <w:shd w:fill="B0894B" w:val="clear"/>
+            <w:tcMar>
+              <w:top w:type="dxa" w:w="40"/>
+              <w:left w:type="dxa" w:w="80"/>
+              <w:bottom w:type="dxa" w:w="40"/>
+              <w:right w:type="dxa" w:w="80"/>
+            </w:tcMar>
+            <w:vAlign w:val="center"/>
+          </w:tcPr>
+          <w:p>
+            <w:pPr>
+              <w:spacing w:after="0" w:line="230"/>
+              <w:jc w:val="left"/>
+            </w:pPr>
+            <w:r>
+              <w:rPr>
+                <w:rFonts w:ascii="Calibri" w:cs="Calibri" w:eastAsia="Calibri" w:hAnsi="Calibri"/>
+                <w:b/>
+                <w:bCs/>
+                <w:color w:val="FFFFFF"/>
+                <w:sz w:val="17"/>
+                <w:szCs w:val="17"/>
+              </w:rPr>
+              <w:t xml:space="preserve">What it measures</w:t>
+            </w:r>
+          </w:p>
+        </w:tc>
+        <w:tc>
+          <w:tcPr>
+            <w:shd w:fill="B0894B" w:val="clear"/>
+            <w:tcMar>
+              <w:top w:type="dxa" w:w="40"/>
+              <w:left w:type="dxa" w:w="80"/>
+              <w:bottom w:type="dxa" w:w="40"/>
+              <w:right w:type="dxa" w:w="80"/>
+            </w:tcMar>
+            <w:vAlign w:val="center"/>
+          </w:tcPr>
+          <w:p>
+            <w:pPr>
+              <w:spacing w:after="0" w:line="230"/>
+              <w:jc w:val="right"/>
+            </w:pPr>
+            <w:r>
+              <w:rPr>
+                <w:rFonts w:ascii="Calibri" w:cs="Calibri" w:eastAsia="Calibri" w:hAnsi="Calibri"/>
+                <w:b/>
+                <w:bCs/>
+                <w:color w:val="FFFFFF"/>
+                <w:sz w:val="17"/>
+                <w:szCs w:val="17"/>
+              </w:rPr>
+              <w:t xml:space="preserve">Output</w:t>
+            </w:r>
+          </w:p>
+        </w:tc>
+        <w:tc>
+          <w:tcPr>
+            <w:shd w:fill="B0894B" w:val="clear"/>
+            <w:tcMar>
+              <w:top w:type="dxa" w:w="40"/>
+              <w:left w:type="dxa" w:w="80"/>
+              <w:bottom w:type="dxa" w:w="40"/>
+              <w:right w:type="dxa" w:w="80"/>
+            </w:tcMar>
+            <w:vAlign w:val="center"/>
+          </w:tcPr>
+          <w:p>
+            <w:pPr>
+              <w:spacing w:after="0" w:line="230"/>
+              <w:jc w:val="left"/>
+            </w:pPr>
+            <w:r>
+              <w:rPr>
+                <w:rFonts w:ascii="Calibri" w:cs="Calibri" w:eastAsia="Calibri" w:hAnsi="Calibri"/>
+                <w:b/>
+                <w:bCs/>
+                <w:color w:val="FFFFFF"/>
+                <w:sz w:val="17"/>
+                <w:szCs w:val="17"/>
+              </w:rPr>
+              <w:t xml:space="preserve">Takeaway</w:t>
+            </w:r>
+          </w:p>
+        </w:tc>
+      </w:tr>
+      <w:tr>
+        <w:tc>
+          <w:tcPr>
+            <w:gridSpan w:val="4"/>
+            <w:shd w:fill="1B5E5E" w:val="clear"/>
+            <w:tcMar>
+              <w:top w:type="dxa" w:w="46"/>
+              <w:left w:type="dxa" w:w="100"/>
+              <w:bottom w:type="dxa" w:w="46"/>
+              <w:right w:type="dxa" w:w="100"/>
+            </w:tcMar>
+          </w:tcPr>
+          <w:p>
+            <w:pPr>
+              <w:spacing w:after="0" w:line="230"/>
+            </w:pPr>
+            <w:r>
+              <w:rPr>
+                <w:rFonts w:ascii="Calibri" w:cs="Calibri" w:eastAsia="Calibri" w:hAnsi="Calibri"/>
+                <w:b/>
+                <w:bCs/>
+                <w:color w:val="FFFFFF"/>
+                <w:sz w:val="17"/>
+                <w:szCs w:val="17"/>
+              </w:rPr>
+              <w:t xml:space="preserve">FUNDAMENTAL — what the operating businesses &amp; assets are worth (the anchor)</w:t>
+            </w:r>
+          </w:p>
+        </w:tc>
+      </w:tr>
+      <w:tr>
+        <w:tc>
+          <w:tcPr>
+            <w:shd w:fill="F3F8F8" w:val="clear"/>
+            <w:tcMar>
+              <w:top w:type="dxa" w:w="34"/>
+              <w:left w:type="dxa" w:w="80"/>
+              <w:bottom w:type="dxa" w:w="34"/>
+              <w:right w:type="dxa" w:w="80"/>
+            </w:tcMar>
+            <w:vAlign w:val="center"/>
+          </w:tcPr>
+          <w:p>
+            <w:pPr>
+              <w:spacing w:after="0" w:line="230"/>
+              <w:jc w:val="left"/>
+            </w:pPr>
+            <w:r>
+              <w:rPr>
+                <w:rFonts w:ascii="Calibri" w:cs="Calibri" w:eastAsia="Calibri" w:hAnsi="Calibri"/>
+                <w:b w:val="false"/>
+                <w:bCs w:val="false"/>
+                <w:i w:val="false"/>
+                <w:iCs w:val="false"/>
+                <w:color w:val="222222"/>
+                <w:sz w:val="17"/>
+                <w:szCs w:val="17"/>
+              </w:rPr>
+              <w:t xml:space="preserve">Sum-of-the-parts (primary)</w:t>
+            </w:r>
+          </w:p>
+        </w:tc>
+        <w:tc>
+          <w:tcPr>
+            <w:shd w:fill="F3F8F8" w:val="clear"/>
+            <w:tcMar>
+              <w:top w:type="dxa" w:w="34"/>
+              <w:left w:type="dxa" w:w="80"/>
+              <w:bottom w:type="dxa" w:w="34"/>
+              <w:right w:type="dxa" w:w="80"/>
+            </w:tcMar>
+            <w:vAlign w:val="center"/>
+          </w:tcPr>
+          <w:p>
+            <w:pPr>
+              <w:spacing w:after="0" w:line="230"/>
+              <w:jc w:val="left"/>
+            </w:pPr>
+            <w:r>
+              <w:rPr>
+                <w:rFonts w:ascii="Calibri" w:cs="Calibri" w:eastAsia="Calibri" w:hAnsi="Calibri"/>
+                <w:b w:val="false"/>
+                <w:bCs w:val="false"/>
+                <w:i w:val="false"/>
+                <w:iCs w:val="false"/>
+                <w:color w:val="222222"/>
+                <w:sz w:val="17"/>
+                <w:szCs w:val="17"/>
+              </w:rPr>
+              <w:t xml:space="preserve">Marked stakes + recurring portfolio − holdco discount</w:t>
+            </w:r>
+          </w:p>
+        </w:tc>
+        <w:tc>
+          <w:tcPr>
+            <w:shd w:fill="F3F8F8" w:val="clear"/>
+            <w:tcMar>
+              <w:top w:type="dxa" w:w="34"/>
+              <w:left w:type="dxa" w:w="80"/>
+              <w:bottom w:type="dxa" w:w="34"/>
+              <w:right w:type="dxa" w:w="80"/>
+            </w:tcMar>
+            <w:vAlign w:val="center"/>
+          </w:tcPr>
+          <w:p>
+            <w:pPr>
+              <w:spacing w:after="0" w:line="230"/>
+              <w:jc w:val="right"/>
+            </w:pPr>
+            <w:r>
+              <w:rPr>
+                <w:rFonts w:ascii="Calibri" w:cs="Calibri" w:eastAsia="Calibri" w:hAnsi="Calibri"/>
+                <w:b/>
+                <w:bCs/>
+                <w:i w:val="false"/>
+                <w:iCs w:val="false"/>
+                <w:color w:val="222222"/>
+                <w:sz w:val="17"/>
+                <w:szCs w:val="17"/>
+              </w:rPr>
+              <w:t xml:space="preserve">AED 14.12</w:t>
+            </w:r>
+          </w:p>
+        </w:tc>
+        <w:tc>
+          <w:tcPr>
+            <w:shd w:fill="F3F8F8" w:val="clear"/>
+            <w:tcMar>
+              <w:top w:type="dxa" w:w="34"/>
+              <w:left w:type="dxa" w:w="80"/>
+              <w:bottom w:type="dxa" w:w="34"/>
+              <w:right w:type="dxa" w:w="80"/>
+            </w:tcMar>
+            <w:vAlign w:val="center"/>
+          </w:tcPr>
+          <w:p>
+            <w:pPr>
+              <w:spacing w:after="0" w:line="230"/>
+              <w:jc w:val="left"/>
+            </w:pPr>
+            <w:r>
+              <w:rPr>
+                <w:rFonts w:ascii="Calibri" w:cs="Calibri" w:eastAsia="Calibri" w:hAnsi="Calibri"/>
+                <w:b w:val="false"/>
+                <w:bCs w:val="false"/>
+                <w:i w:val="false"/>
+                <w:iCs w:val="false"/>
+                <w:color w:val="222222"/>
+                <w:sz w:val="17"/>
+                <w:szCs w:val="17"/>
+              </w:rPr>
+              <w:t xml:space="preserve">+16% vs spot</w:t>
+            </w:r>
+          </w:p>
+        </w:tc>
+      </w:tr>
+      <w:tr>
+        <w:tc>
+          <w:tcPr>
+            <w:tcMar>
+              <w:top w:type="dxa" w:w="34"/>
+              <w:left w:type="dxa" w:w="80"/>
+              <w:bottom w:type="dxa" w:w="34"/>
+              <w:right w:type="dxa" w:w="80"/>
+            </w:tcMar>
+            <w:vAlign w:val="center"/>
+          </w:tcPr>
+          <w:p>
+            <w:pPr>
+              <w:spacing w:after="0" w:line="230"/>
+              <w:jc w:val="left"/>
+            </w:pPr>
+            <w:r>
+              <w:rPr>
+                <w:rFonts w:ascii="Calibri" w:cs="Calibri" w:eastAsia="Calibri" w:hAnsi="Calibri"/>
+                <w:b w:val="false"/>
+                <w:bCs w:val="false"/>
+                <w:i w:val="false"/>
+                <w:iCs w:val="false"/>
+                <w:color w:val="222222"/>
+                <w:sz w:val="17"/>
+                <w:szCs w:val="17"/>
+              </w:rPr>
+              <w:t xml:space="preserve">Consolidated DCF (cross-check)</w:t>
+            </w:r>
+          </w:p>
+        </w:tc>
+        <w:tc>
+          <w:tcPr>
+            <w:tcMar>
+              <w:top w:type="dxa" w:w="34"/>
+              <w:left w:type="dxa" w:w="80"/>
+              <w:bottom w:type="dxa" w:w="34"/>
+              <w:right w:type="dxa" w:w="80"/>
+            </w:tcMar>
+            <w:vAlign w:val="center"/>
+          </w:tcPr>
+          <w:p>
+            <w:pPr>
+              <w:spacing w:after="0" w:line="230"/>
+              <w:jc w:val="left"/>
+            </w:pPr>
+            <w:r>
+              <w:rPr>
+                <w:rFonts w:ascii="Calibri" w:cs="Calibri" w:eastAsia="Calibri" w:hAnsi="Calibri"/>
+                <w:b w:val="false"/>
+                <w:bCs w:val="false"/>
+                <w:i w:val="false"/>
+                <w:iCs w:val="false"/>
+                <w:color w:val="222222"/>
+                <w:sz w:val="17"/>
+                <w:szCs w:val="17"/>
+              </w:rPr>
+              <w:t xml:space="preserve">Discounted 5-yr operating cash flows</w:t>
+            </w:r>
+          </w:p>
+        </w:tc>
+        <w:tc>
+          <w:tcPr>
+            <w:tcMar>
+              <w:top w:type="dxa" w:w="34"/>
+              <w:left w:type="dxa" w:w="80"/>
+              <w:bottom w:type="dxa" w:w="34"/>
+              <w:right w:type="dxa" w:w="80"/>
+            </w:tcMar>
+            <w:vAlign w:val="center"/>
+          </w:tcPr>
+          <w:p>
+            <w:pPr>
+              <w:spacing w:after="0" w:line="230"/>
+              <w:jc w:val="right"/>
+            </w:pPr>
+            <w:r>
+              <w:rPr>
+                <w:rFonts w:ascii="Calibri" w:cs="Calibri" w:eastAsia="Calibri" w:hAnsi="Calibri"/>
+                <w:b/>
+                <w:bCs/>
+                <w:i w:val="false"/>
+                <w:iCs w:val="false"/>
+                <w:color w:val="222222"/>
+                <w:sz w:val="17"/>
+                <w:szCs w:val="17"/>
+              </w:rPr>
+              <w:t xml:space="preserve">AED 14.74</w:t>
+            </w:r>
+          </w:p>
+        </w:tc>
+        <w:tc>
+          <w:tcPr>
+            <w:tcMar>
+              <w:top w:type="dxa" w:w="34"/>
+              <w:left w:type="dxa" w:w="80"/>
+              <w:bottom w:type="dxa" w:w="34"/>
+              <w:right w:type="dxa" w:w="80"/>
+            </w:tcMar>
+            <w:vAlign w:val="center"/>
+          </w:tcPr>
+          <w:p>
+            <w:pPr>
+              <w:spacing w:after="0" w:line="230"/>
+              <w:jc w:val="left"/>
+            </w:pPr>
+            <w:r>
+              <w:rPr>
+                <w:rFonts w:ascii="Calibri" w:cs="Calibri" w:eastAsia="Calibri" w:hAnsi="Calibri"/>
+                <w:b w:val="false"/>
+                <w:bCs w:val="false"/>
+                <w:i w:val="false"/>
+                <w:iCs w:val="false"/>
+                <w:color w:val="222222"/>
+                <w:sz w:val="17"/>
+                <w:szCs w:val="17"/>
+              </w:rPr>
+              <w:t xml:space="preserve">+21% · cross-check</w:t>
+            </w:r>
+          </w:p>
+        </w:tc>
+      </w:tr>
+      <w:tr>
+        <w:tc>
+          <w:tcPr>
+            <w:shd w:fill="F3F8F8" w:val="clear"/>
+            <w:tcMar>
+              <w:top w:type="dxa" w:w="34"/>
+              <w:left w:type="dxa" w:w="80"/>
+              <w:bottom w:type="dxa" w:w="34"/>
+              <w:right w:type="dxa" w:w="80"/>
+            </w:tcMar>
+            <w:vAlign w:val="center"/>
+          </w:tcPr>
+          <w:p>
+            <w:pPr>
+              <w:spacing w:after="0" w:line="230"/>
+              <w:jc w:val="left"/>
+            </w:pPr>
+            <w:r>
+              <w:rPr>
+                <w:rFonts w:ascii="Calibri" w:cs="Calibri" w:eastAsia="Calibri" w:hAnsi="Calibri"/>
+                <w:b w:val="false"/>
+                <w:bCs w:val="false"/>
+                <w:i w:val="false"/>
+                <w:iCs w:val="false"/>
+                <w:color w:val="222222"/>
+                <w:sz w:val="17"/>
+                <w:szCs w:val="17"/>
+              </w:rPr>
+              <w:t xml:space="preserve">Relative multiples</w:t>
+            </w:r>
+          </w:p>
+        </w:tc>
+        <w:tc>
+          <w:tcPr>
+            <w:shd w:fill="F3F8F8" w:val="clear"/>
+            <w:tcMar>
+              <w:top w:type="dxa" w:w="34"/>
+              <w:left w:type="dxa" w:w="80"/>
+              <w:bottom w:type="dxa" w:w="34"/>
+              <w:right w:type="dxa" w:w="80"/>
+            </w:tcMar>
+            <w:vAlign w:val="center"/>
+          </w:tcPr>
+          <w:p>
+            <w:pPr>
+              <w:spacing w:after="0" w:line="230"/>
+              <w:jc w:val="left"/>
+            </w:pPr>
+            <w:r>
+              <w:rPr>
+                <w:rFonts w:ascii="Calibri" w:cs="Calibri" w:eastAsia="Calibri" w:hAnsi="Calibri"/>
+                <w:b w:val="false"/>
+                <w:bCs w:val="false"/>
+                <w:i w:val="false"/>
+                <w:iCs w:val="false"/>
+                <w:color w:val="222222"/>
+                <w:sz w:val="17"/>
+                <w:szCs w:val="17"/>
+              </w:rPr>
+              <w:t xml:space="preserve">EV/EBITDA · P/E · P/B vs peers</w:t>
+            </w:r>
+          </w:p>
+        </w:tc>
+        <w:tc>
+          <w:tcPr>
+            <w:shd w:fill="F3F8F8" w:val="clear"/>
+            <w:tcMar>
+              <w:top w:type="dxa" w:w="34"/>
+              <w:left w:type="dxa" w:w="80"/>
+              <w:bottom w:type="dxa" w:w="34"/>
+              <w:right w:type="dxa" w:w="80"/>
+            </w:tcMar>
+            <w:vAlign w:val="center"/>
+          </w:tcPr>
+          <w:p>
+            <w:pPr>
+              <w:spacing w:after="0" w:line="230"/>
+              <w:jc w:val="right"/>
+            </w:pPr>
+            <w:r>
+              <w:rPr>
+                <w:rFonts w:ascii="Calibri" w:cs="Calibri" w:eastAsia="Calibri" w:hAnsi="Calibri"/>
+                <w:b/>
+                <w:bCs/>
+                <w:i w:val="false"/>
+                <w:iCs w:val="false"/>
+                <w:color w:val="222222"/>
+                <w:sz w:val="17"/>
+                <w:szCs w:val="17"/>
+              </w:rPr>
+              <w:t xml:space="preserve">AED 15.53</w:t>
+            </w:r>
+          </w:p>
+        </w:tc>
+        <w:tc>
+          <w:tcPr>
+            <w:shd w:fill="F3F8F8" w:val="clear"/>
+            <w:tcMar>
+              <w:top w:type="dxa" w:w="34"/>
+              <w:left w:type="dxa" w:w="80"/>
+              <w:bottom w:type="dxa" w:w="34"/>
+              <w:right w:type="dxa" w:w="80"/>
+            </w:tcMar>
+            <w:vAlign w:val="center"/>
+          </w:tcPr>
+          <w:p>
+            <w:pPr>
+              <w:spacing w:after="0" w:line="230"/>
+              <w:jc w:val="left"/>
+            </w:pPr>
+            <w:r>
+              <w:rPr>
+                <w:rFonts w:ascii="Calibri" w:cs="Calibri" w:eastAsia="Calibri" w:hAnsi="Calibri"/>
+                <w:b w:val="false"/>
+                <w:bCs w:val="false"/>
+                <w:i w:val="false"/>
+                <w:iCs w:val="false"/>
+                <w:color w:val="222222"/>
+                <w:sz w:val="17"/>
+                <w:szCs w:val="17"/>
+              </w:rPr>
+              <w:t xml:space="preserve">+28% · the ceiling</w:t>
+            </w:r>
+          </w:p>
+        </w:tc>
+      </w:tr>
+      <w:tr>
+        <w:tc>
+          <w:tcPr>
+            <w:tcMar>
+              <w:top w:type="dxa" w:w="34"/>
+              <w:left w:type="dxa" w:w="80"/>
+              <w:bottom w:type="dxa" w:w="34"/>
+              <w:right w:type="dxa" w:w="80"/>
+            </w:tcMar>
+            <w:vAlign w:val="center"/>
+          </w:tcPr>
+          <w:p>
+            <w:pPr>
+              <w:spacing w:after="0" w:line="230"/>
+              <w:jc w:val="left"/>
+            </w:pPr>
+            <w:r>
+              <w:rPr>
+                <w:rFonts w:ascii="Calibri" w:cs="Calibri" w:eastAsia="Calibri" w:hAnsi="Calibri"/>
+                <w:b w:val="false"/>
+                <w:bCs w:val="false"/>
+                <w:i w:val="false"/>
+                <w:iCs w:val="false"/>
+                <w:color w:val="222222"/>
+                <w:sz w:val="17"/>
+                <w:szCs w:val="17"/>
+              </w:rPr>
+              <w:t xml:space="preserve">Normalized earnings</w:t>
+            </w:r>
+          </w:p>
+        </w:tc>
+        <w:tc>
+          <w:tcPr>
+            <w:tcMar>
+              <w:top w:type="dxa" w:w="34"/>
+              <w:left w:type="dxa" w:w="80"/>
+              <w:bottom w:type="dxa" w:w="34"/>
+              <w:right w:type="dxa" w:w="80"/>
+            </w:tcMar>
+            <w:vAlign w:val="center"/>
+          </w:tcPr>
+          <w:p>
+            <w:pPr>
+              <w:spacing w:after="0" w:line="230"/>
+              <w:jc w:val="left"/>
+            </w:pPr>
+            <w:r>
+              <w:rPr>
+                <w:rFonts w:ascii="Calibri" w:cs="Calibri" w:eastAsia="Calibri" w:hAnsi="Calibri"/>
+                <w:b w:val="false"/>
+                <w:bCs w:val="false"/>
+                <w:i w:val="false"/>
+                <w:iCs w:val="false"/>
+                <w:color w:val="222222"/>
+                <w:sz w:val="17"/>
+                <w:szCs w:val="17"/>
+              </w:rPr>
+              <w:t xml:space="preserve">Mid-cycle earnings × multiple</w:t>
+            </w:r>
+          </w:p>
+        </w:tc>
+        <w:tc>
+          <w:tcPr>
+            <w:tcMar>
+              <w:top w:type="dxa" w:w="34"/>
+              <w:left w:type="dxa" w:w="80"/>
+              <w:bottom w:type="dxa" w:w="34"/>
+              <w:right w:type="dxa" w:w="80"/>
+            </w:tcMar>
+            <w:vAlign w:val="center"/>
+          </w:tcPr>
+          <w:p>
+            <w:pPr>
+              <w:spacing w:after="0" w:line="230"/>
+              <w:jc w:val="right"/>
+            </w:pPr>
+            <w:r>
+              <w:rPr>
+                <w:rFonts w:ascii="Calibri" w:cs="Calibri" w:eastAsia="Calibri" w:hAnsi="Calibri"/>
+                <w:b/>
+                <w:bCs/>
+                <w:i w:val="false"/>
+                <w:iCs w:val="false"/>
+                <w:color w:val="222222"/>
+                <w:sz w:val="17"/>
+                <w:szCs w:val="17"/>
+              </w:rPr>
+              <w:t xml:space="preserve">AED 15.27</w:t>
+            </w:r>
+          </w:p>
+        </w:tc>
+        <w:tc>
+          <w:tcPr>
+            <w:tcMar>
+              <w:top w:type="dxa" w:w="34"/>
+              <w:left w:type="dxa" w:w="80"/>
+              <w:bottom w:type="dxa" w:w="34"/>
+              <w:right w:type="dxa" w:w="80"/>
+            </w:tcMar>
+            <w:vAlign w:val="center"/>
+          </w:tcPr>
+          <w:p>
+            <w:pPr>
+              <w:spacing w:after="0" w:line="230"/>
+              <w:jc w:val="left"/>
+            </w:pPr>
+            <w:r>
+              <w:rPr>
+                <w:rFonts w:ascii="Calibri" w:cs="Calibri" w:eastAsia="Calibri" w:hAnsi="Calibri"/>
+                <w:b w:val="false"/>
+                <w:bCs w:val="false"/>
+                <w:i w:val="false"/>
+                <w:iCs w:val="false"/>
+                <w:color w:val="222222"/>
+                <w:sz w:val="17"/>
+                <w:szCs w:val="17"/>
+              </w:rPr>
+              <w:t xml:space="preserve">+26%</w:t>
+            </w:r>
+          </w:p>
+        </w:tc>
+      </w:tr>
+      <w:tr>
+        <w:tc>
+          <w:tcPr>
+            <w:shd w:fill="F3F8F8" w:val="clear"/>
+            <w:tcMar>
+              <w:top w:type="dxa" w:w="34"/>
+              <w:left w:type="dxa" w:w="80"/>
+              <w:bottom w:type="dxa" w:w="34"/>
+              <w:right w:type="dxa" w:w="80"/>
+            </w:tcMar>
+            <w:vAlign w:val="center"/>
+          </w:tcPr>
+          <w:p>
+            <w:pPr>
+              <w:spacing w:after="0" w:line="230"/>
+              <w:jc w:val="left"/>
+            </w:pPr>
+            <w:r>
+              <w:rPr>
+                <w:rFonts w:ascii="Calibri" w:cs="Calibri" w:eastAsia="Calibri" w:hAnsi="Calibri"/>
+                <w:b/>
+                <w:bCs/>
+                <w:i w:val="false"/>
+                <w:iCs w:val="false"/>
+                <w:color w:val="222222"/>
+                <w:sz w:val="17"/>
+                <w:szCs w:val="17"/>
+              </w:rPr>
+              <w:t xml:space="preserve">Weighted central</w:t>
+            </w:r>
+          </w:p>
+        </w:tc>
+        <w:tc>
+          <w:tcPr>
+            <w:shd w:fill="F3F8F8" w:val="clear"/>
+            <w:tcMar>
+              <w:top w:type="dxa" w:w="34"/>
+              <w:left w:type="dxa" w:w="80"/>
+              <w:bottom w:type="dxa" w:w="34"/>
+              <w:right w:type="dxa" w:w="80"/>
+            </w:tcMar>
+            <w:vAlign w:val="center"/>
+          </w:tcPr>
+          <w:p>
+            <w:pPr>
+              <w:spacing w:after="0" w:line="230"/>
+              <w:jc w:val="left"/>
+            </w:pPr>
+            <w:r>
+              <w:rPr>
+                <w:rFonts w:ascii="Calibri" w:cs="Calibri" w:eastAsia="Calibri" w:hAnsi="Calibri"/>
+                <w:b w:val="false"/>
+                <w:bCs w:val="false"/>
+                <w:i w:val="false"/>
+                <w:iCs w:val="false"/>
+                <w:color w:val="222222"/>
+                <w:sz w:val="17"/>
+                <w:szCs w:val="17"/>
+              </w:rPr>
+              <w:t xml:space="preserve">Blend 35 / 20 / 15 / 30</w:t>
+            </w:r>
+          </w:p>
+        </w:tc>
+        <w:tc>
+          <w:tcPr>
+            <w:shd w:fill="F3F8F8" w:val="clear"/>
+            <w:tcMar>
+              <w:top w:type="dxa" w:w="34"/>
+              <w:left w:type="dxa" w:w="80"/>
+              <w:bottom w:type="dxa" w:w="34"/>
+              <w:right w:type="dxa" w:w="80"/>
+            </w:tcMar>
+            <w:vAlign w:val="center"/>
+          </w:tcPr>
+          <w:p>
+            <w:pPr>
+              <w:spacing w:after="0" w:line="230"/>
+              <w:jc w:val="right"/>
+            </w:pPr>
+            <w:r>
+              <w:rPr>
+                <w:rFonts w:ascii="Calibri" w:cs="Calibri" w:eastAsia="Calibri" w:hAnsi="Calibri"/>
+                <w:b/>
+                <w:bCs/>
+                <w:i w:val="false"/>
+                <w:iCs w:val="false"/>
+                <w:color w:val="222222"/>
+                <w:sz w:val="17"/>
+                <w:szCs w:val="17"/>
+              </w:rPr>
+              <w:t xml:space="preserve">AED 14.80</w:t>
+            </w:r>
+          </w:p>
+        </w:tc>
+        <w:tc>
+          <w:tcPr>
+            <w:shd w:fill="F3F8F8" w:val="clear"/>
+            <w:tcMar>
+              <w:top w:type="dxa" w:w="34"/>
+              <w:left w:type="dxa" w:w="80"/>
+              <w:bottom w:type="dxa" w:w="34"/>
+              <w:right w:type="dxa" w:w="80"/>
+            </w:tcMar>
+            <w:vAlign w:val="center"/>
+          </w:tcPr>
+          <w:p>
+            <w:pPr>
+              <w:spacing w:after="0" w:line="230"/>
+              <w:jc w:val="left"/>
+            </w:pPr>
+            <w:r>
+              <w:rPr>
+                <w:rFonts w:ascii="Calibri" w:cs="Calibri" w:eastAsia="Calibri" w:hAnsi="Calibri"/>
+                <w:b/>
+                <w:bCs/>
+                <w:i w:val="false"/>
+                <w:iCs w:val="false"/>
+                <w:color w:val="222222"/>
+                <w:sz w:val="17"/>
+                <w:szCs w:val="17"/>
+              </w:rPr>
+              <w:t xml:space="preserve">+22% vs AED 12.14</w:t>
+            </w:r>
+          </w:p>
+        </w:tc>
+      </w:tr>
+      <w:tr>
+        <w:tc>
+          <w:tcPr>
+            <w:gridSpan w:val="4"/>
+            <w:shd w:fill="1B5E5E" w:val="clear"/>
+            <w:tcMar>
+              <w:top w:type="dxa" w:w="46"/>
+              <w:left w:type="dxa" w:w="100"/>
+              <w:bottom w:type="dxa" w:w="46"/>
+              <w:right w:type="dxa" w:w="100"/>
+            </w:tcMar>
+          </w:tcPr>
+          <w:p>
+            <w:pPr>
+              <w:spacing w:after="0" w:line="230"/>
+            </w:pPr>
+            <w:r>
+              <w:rPr>
+                <w:rFonts w:ascii="Calibri" w:cs="Calibri" w:eastAsia="Calibri" w:hAnsi="Calibri"/>
+                <w:b/>
+                <w:bCs/>
+                <w:color w:val="FFFFFF"/>
+                <w:sz w:val="17"/>
+                <w:szCs w:val="17"/>
+              </w:rPr>
+              <w:t xml:space="preserve">TECHNICAL — what the tape is doing (timing, not value)</w:t>
+            </w:r>
+          </w:p>
+        </w:tc>
+      </w:tr>
+      <w:tr>
+        <w:tc>
+          <w:tcPr>
+            <w:tcMar>
+              <w:top w:type="dxa" w:w="34"/>
+              <w:left w:type="dxa" w:w="80"/>
+              <w:bottom w:type="dxa" w:w="34"/>
+              <w:right w:type="dxa" w:w="80"/>
+            </w:tcMar>
+            <w:vAlign w:val="center"/>
+          </w:tcPr>
+          <w:p>
+            <w:pPr>
+              <w:spacing w:after="0" w:line="230"/>
+              <w:jc w:val="left"/>
+            </w:pPr>
+            <w:r>
+              <w:rPr>
+                <w:rFonts w:ascii="Calibri" w:cs="Calibri" w:eastAsia="Calibri" w:hAnsi="Calibri"/>
+                <w:b w:val="false"/>
+                <w:bCs w:val="false"/>
+                <w:i w:val="false"/>
+                <w:iCs w:val="false"/>
+                <w:color w:val="222222"/>
+                <w:sz w:val="17"/>
+                <w:szCs w:val="17"/>
+              </w:rPr>
+              <w:t xml:space="preserve">Trend</w:t>
+            </w:r>
+          </w:p>
+        </w:tc>
+        <w:tc>
+          <w:tcPr>
+            <w:tcMar>
+              <w:top w:type="dxa" w:w="34"/>
+              <w:left w:type="dxa" w:w="80"/>
+              <w:bottom w:type="dxa" w:w="34"/>
+              <w:right w:type="dxa" w:w="80"/>
+            </w:tcMar>
+            <w:vAlign w:val="center"/>
+          </w:tcPr>
+          <w:p>
+            <w:pPr>
+              <w:spacing w:after="0" w:line="230"/>
+              <w:jc w:val="left"/>
+            </w:pPr>
+            <w:r>
+              <w:rPr>
+                <w:rFonts w:ascii="Calibri" w:cs="Calibri" w:eastAsia="Calibri" w:hAnsi="Calibri"/>
+                <w:b w:val="false"/>
+                <w:bCs w:val="false"/>
+                <w:i w:val="false"/>
+                <w:iCs w:val="false"/>
+                <w:color w:val="222222"/>
+                <w:sz w:val="17"/>
+                <w:szCs w:val="17"/>
+              </w:rPr>
+              <w:t xml:space="preserve">Price vs the 20 / 50 / 200-day averages</w:t>
+            </w:r>
+          </w:p>
+        </w:tc>
+        <w:tc>
+          <w:tcPr>
+            <w:tcMar>
+              <w:top w:type="dxa" w:w="34"/>
+              <w:left w:type="dxa" w:w="80"/>
+              <w:bottom w:type="dxa" w:w="34"/>
+              <w:right w:type="dxa" w:w="80"/>
+            </w:tcMar>
+            <w:vAlign w:val="center"/>
+          </w:tcPr>
+          <w:p>
+            <w:pPr>
+              <w:spacing w:after="0" w:line="230"/>
+              <w:jc w:val="right"/>
+            </w:pPr>
+            <w:r>
+              <w:rPr>
+                <w:rFonts w:ascii="Calibri" w:cs="Calibri" w:eastAsia="Calibri" w:hAnsi="Calibri"/>
+                <w:b/>
+                <w:bCs/>
+                <w:i w:val="false"/>
+                <w:iCs w:val="false"/>
+                <w:color w:val="222222"/>
+                <w:sz w:val="17"/>
+                <w:szCs w:val="17"/>
+              </w:rPr>
+              <w:t xml:space="preserve">Above 20/50, below 200</w:t>
+            </w:r>
+          </w:p>
+        </w:tc>
+        <w:tc>
+          <w:tcPr>
+            <w:tcMar>
+              <w:top w:type="dxa" w:w="34"/>
+              <w:left w:type="dxa" w:w="80"/>
+              <w:bottom w:type="dxa" w:w="34"/>
+              <w:right w:type="dxa" w:w="80"/>
+            </w:tcMar>
+            <w:vAlign w:val="center"/>
+          </w:tcPr>
+          <w:p>
+            <w:pPr>
+              <w:spacing w:after="0" w:line="230"/>
+              <w:jc w:val="left"/>
+            </w:pPr>
+            <w:r>
+              <w:rPr>
+                <w:rFonts w:ascii="Calibri" w:cs="Calibri" w:eastAsia="Calibri" w:hAnsi="Calibri"/>
+                <w:b w:val="false"/>
+                <w:bCs w:val="false"/>
+                <w:i w:val="false"/>
+                <w:iCs w:val="false"/>
+                <w:color w:val="222222"/>
+                <w:sz w:val="17"/>
+                <w:szCs w:val="17"/>
+              </w:rPr>
+              <w:t xml:space="preserve">Consolidating after a ~29% correction</w:t>
+            </w:r>
+          </w:p>
+        </w:tc>
+      </w:tr>
+      <w:tr>
+        <w:tc>
+          <w:tcPr>
+            <w:shd w:fill="F3F8F8" w:val="clear"/>
+            <w:tcMar>
+              <w:top w:type="dxa" w:w="34"/>
+              <w:left w:type="dxa" w:w="80"/>
+              <w:bottom w:type="dxa" w:w="34"/>
+              <w:right w:type="dxa" w:w="80"/>
+            </w:tcMar>
+            <w:vAlign w:val="center"/>
+          </w:tcPr>
+          <w:p>
+            <w:pPr>
+              <w:spacing w:after="0" w:line="230"/>
+              <w:jc w:val="left"/>
+            </w:pPr>
+            <w:r>
+              <w:rPr>
+                <w:rFonts w:ascii="Calibri" w:cs="Calibri" w:eastAsia="Calibri" w:hAnsi="Calibri"/>
+                <w:b w:val="false"/>
+                <w:bCs w:val="false"/>
+                <w:i w:val="false"/>
+                <w:iCs w:val="false"/>
+                <w:color w:val="222222"/>
+                <w:sz w:val="17"/>
+                <w:szCs w:val="17"/>
+              </w:rPr>
+              <w:t xml:space="preserve">Momentum / range</w:t>
+            </w:r>
+          </w:p>
+        </w:tc>
+        <w:tc>
+          <w:tcPr>
+            <w:shd w:fill="F3F8F8" w:val="clear"/>
+            <w:tcMar>
+              <w:top w:type="dxa" w:w="34"/>
+              <w:left w:type="dxa" w:w="80"/>
+              <w:bottom w:type="dxa" w:w="34"/>
+              <w:right w:type="dxa" w:w="80"/>
+            </w:tcMar>
+            <w:vAlign w:val="center"/>
+          </w:tcPr>
+          <w:p>
+            <w:pPr>
+              <w:spacing w:after="0" w:line="230"/>
+              <w:jc w:val="left"/>
+            </w:pPr>
+            <w:r>
+              <w:rPr>
+                <w:rFonts w:ascii="Calibri" w:cs="Calibri" w:eastAsia="Calibri" w:hAnsi="Calibri"/>
+                <w:b w:val="false"/>
+                <w:bCs w:val="false"/>
+                <w:i w:val="false"/>
+                <w:iCs w:val="false"/>
+                <w:color w:val="222222"/>
+                <w:sz w:val="17"/>
+                <w:szCs w:val="17"/>
+              </w:rPr>
+              <w:t xml:space="preserve">RSI · MACD · 52-week range</w:t>
+            </w:r>
+          </w:p>
+        </w:tc>
+        <w:tc>
+          <w:tcPr>
+            <w:shd w:fill="F3F8F8" w:val="clear"/>
+            <w:tcMar>
+              <w:top w:type="dxa" w:w="34"/>
+              <w:left w:type="dxa" w:w="80"/>
+              <w:bottom w:type="dxa" w:w="34"/>
+              <w:right w:type="dxa" w:w="80"/>
+            </w:tcMar>
+            <w:vAlign w:val="center"/>
+          </w:tcPr>
+          <w:p>
+            <w:pPr>
+              <w:spacing w:after="0" w:line="230"/>
+              <w:jc w:val="right"/>
+            </w:pPr>
+            <w:r>
+              <w:rPr>
+                <w:rFonts w:ascii="Calibri" w:cs="Calibri" w:eastAsia="Calibri" w:hAnsi="Calibri"/>
+                <w:b/>
+                <w:bCs/>
+                <w:i w:val="false"/>
+                <w:iCs w:val="false"/>
+                <w:color w:val="222222"/>
+                <w:sz w:val="17"/>
+                <w:szCs w:val="17"/>
+              </w:rPr>
+              <w:t xml:space="preserve">RSI 51 · MACD +0.04</w:t>
+            </w:r>
+          </w:p>
+        </w:tc>
+        <w:tc>
+          <w:tcPr>
+            <w:shd w:fill="F3F8F8" w:val="clear"/>
+            <w:tcMar>
+              <w:top w:type="dxa" w:w="34"/>
+              <w:left w:type="dxa" w:w="80"/>
+              <w:bottom w:type="dxa" w:w="34"/>
+              <w:right w:type="dxa" w:w="80"/>
+            </w:tcMar>
+            <w:vAlign w:val="center"/>
+          </w:tcPr>
+          <w:p>
+            <w:pPr>
+              <w:spacing w:after="0" w:line="230"/>
+              <w:jc w:val="left"/>
+            </w:pPr>
+            <w:r>
+              <w:rPr>
+                <w:rFonts w:ascii="Calibri" w:cs="Calibri" w:eastAsia="Calibri" w:hAnsi="Calibri"/>
+                <w:b w:val="false"/>
+                <w:bCs w:val="false"/>
+                <w:i w:val="false"/>
+                <w:iCs w:val="false"/>
+                <w:color w:val="222222"/>
+                <w:sz w:val="17"/>
+                <w:szCs w:val="17"/>
+              </w:rPr>
+              <w:t xml:space="preserve">Neutral, turning up</w:t>
+            </w:r>
+          </w:p>
+        </w:tc>
+      </w:tr>
+      <w:tr>
+        <w:tc>
+          <w:tcPr>
+            <w:gridSpan w:val="4"/>
+            <w:shd w:fill="1B5E5E" w:val="clear"/>
+            <w:tcMar>
+              <w:top w:type="dxa" w:w="46"/>
+              <w:left w:type="dxa" w:w="100"/>
+              <w:bottom w:type="dxa" w:w="46"/>
+              <w:right w:type="dxa" w:w="100"/>
+            </w:tcMar>
+          </w:tcPr>
+          <w:p>
+            <w:pPr>
+              <w:spacing w:after="0" w:line="230"/>
+            </w:pPr>
+            <w:r>
+              <w:rPr>
+                <w:rFonts w:ascii="Calibri" w:cs="Calibri" w:eastAsia="Calibri" w:hAnsi="Calibri"/>
+                <w:b/>
+                <w:bCs/>
+                <w:color w:val="FFFFFF"/>
+                <w:sz w:val="17"/>
+                <w:szCs w:val="17"/>
+              </w:rPr>
+              <w:t xml:space="preserve">MONTE CARLO — where price could go in 3 months (paths from spot)</w:t>
+            </w:r>
+          </w:p>
+        </w:tc>
+      </w:tr>
+      <w:tr>
+        <w:tc>
+          <w:tcPr>
+            <w:tcMar>
+              <w:top w:type="dxa" w:w="34"/>
+              <w:left w:type="dxa" w:w="80"/>
+              <w:bottom w:type="dxa" w:w="34"/>
+              <w:right w:type="dxa" w:w="80"/>
+            </w:tcMar>
+            <w:vAlign w:val="center"/>
+          </w:tcPr>
+          <w:p>
+            <w:pPr>
+              <w:spacing w:after="0" w:line="230"/>
+              <w:jc w:val="left"/>
+            </w:pPr>
+            <w:r>
+              <w:rPr>
+                <w:rFonts w:ascii="Calibri" w:cs="Calibri" w:eastAsia="Calibri" w:hAnsi="Calibri"/>
+                <w:b w:val="false"/>
+                <w:bCs w:val="false"/>
+                <w:i w:val="false"/>
+                <w:iCs w:val="false"/>
+                <w:color w:val="222222"/>
+                <w:sz w:val="17"/>
+                <w:szCs w:val="17"/>
+              </w:rPr>
+              <w:t xml:space="preserve">T+20 sessions</w:t>
+            </w:r>
+          </w:p>
+        </w:tc>
+        <w:tc>
+          <w:tcPr>
+            <w:tcMar>
+              <w:top w:type="dxa" w:w="34"/>
+              <w:left w:type="dxa" w:w="80"/>
+              <w:bottom w:type="dxa" w:w="34"/>
+              <w:right w:type="dxa" w:w="80"/>
+            </w:tcMar>
+            <w:vAlign w:val="center"/>
+          </w:tcPr>
+          <w:p>
+            <w:pPr>
+              <w:spacing w:after="0" w:line="230"/>
+              <w:jc w:val="left"/>
+            </w:pPr>
+            <w:r>
+              <w:rPr>
+                <w:rFonts w:ascii="Calibri" w:cs="Calibri" w:eastAsia="Calibri" w:hAnsi="Calibri"/>
+                <w:b w:val="false"/>
+                <w:bCs w:val="false"/>
+                <w:i w:val="false"/>
+                <w:iCs w:val="false"/>
+                <w:color w:val="222222"/>
+                <w:sz w:val="17"/>
+                <w:szCs w:val="17"/>
+              </w:rPr>
+              <w:t xml:space="preserve">50,000 paths · 16 factors</w:t>
+            </w:r>
+          </w:p>
+        </w:tc>
+        <w:tc>
+          <w:tcPr>
+            <w:tcMar>
+              <w:top w:type="dxa" w:w="34"/>
+              <w:left w:type="dxa" w:w="80"/>
+              <w:bottom w:type="dxa" w:w="34"/>
+              <w:right w:type="dxa" w:w="80"/>
+            </w:tcMar>
+            <w:vAlign w:val="center"/>
+          </w:tcPr>
+          <w:p>
+            <w:pPr>
+              <w:spacing w:after="0" w:line="230"/>
+              <w:jc w:val="right"/>
+            </w:pPr>
+            <w:r>
+              <w:rPr>
+                <w:rFonts w:ascii="Calibri" w:cs="Calibri" w:eastAsia="Calibri" w:hAnsi="Calibri"/>
+                <w:b/>
+                <w:bCs/>
+                <w:i w:val="false"/>
+                <w:iCs w:val="false"/>
+                <w:color w:val="222222"/>
+                <w:sz w:val="17"/>
+                <w:szCs w:val="17"/>
+              </w:rPr>
+              <w:t xml:space="preserve">p50 12.18</w:t>
+            </w:r>
+          </w:p>
+        </w:tc>
+        <w:tc>
+          <w:tcPr>
+            <w:tcMar>
+              <w:top w:type="dxa" w:w="34"/>
+              <w:left w:type="dxa" w:w="80"/>
+              <w:bottom w:type="dxa" w:w="34"/>
+              <w:right w:type="dxa" w:w="80"/>
+            </w:tcMar>
+            <w:vAlign w:val="center"/>
+          </w:tcPr>
+          <w:p>
+            <w:pPr>
+              <w:spacing w:after="0" w:line="230"/>
+              <w:jc w:val="left"/>
+            </w:pPr>
+            <w:r>
+              <w:rPr>
+                <w:rFonts w:ascii="Calibri" w:cs="Calibri" w:eastAsia="Calibri" w:hAnsi="Calibri"/>
+                <w:b w:val="false"/>
+                <w:bCs w:val="false"/>
+                <w:i w:val="false"/>
+                <w:iCs w:val="false"/>
+                <w:color w:val="222222"/>
+                <w:sz w:val="17"/>
+                <w:szCs w:val="17"/>
+              </w:rPr>
+              <w:t xml:space="preserve">p5 9.98 · p95 14.86 · median ≈ spot</w:t>
+            </w:r>
+          </w:p>
+        </w:tc>
+      </w:tr>
+      <w:tr>
+        <w:tc>
+          <w:tcPr>
+            <w:shd w:fill="F3F8F8" w:val="clear"/>
+            <w:tcMar>
+              <w:top w:type="dxa" w:w="34"/>
+              <w:left w:type="dxa" w:w="80"/>
+              <w:bottom w:type="dxa" w:w="34"/>
+              <w:right w:type="dxa" w:w="80"/>
+            </w:tcMar>
+            <w:vAlign w:val="center"/>
+          </w:tcPr>
+          <w:p>
+            <w:pPr>
+              <w:spacing w:after="0" w:line="230"/>
+              <w:jc w:val="left"/>
+            </w:pPr>
+            <w:r>
+              <w:rPr>
+                <w:rFonts w:ascii="Calibri" w:cs="Calibri" w:eastAsia="Calibri" w:hAnsi="Calibri"/>
+                <w:b w:val="false"/>
+                <w:bCs w:val="false"/>
+                <w:i w:val="false"/>
+                <w:iCs w:val="false"/>
+                <w:color w:val="222222"/>
+                <w:sz w:val="17"/>
+                <w:szCs w:val="17"/>
+              </w:rPr>
+              <w:t xml:space="preserve">T+60 sessions</w:t>
+            </w:r>
+          </w:p>
+        </w:tc>
+        <w:tc>
+          <w:tcPr>
+            <w:shd w:fill="F3F8F8" w:val="clear"/>
+            <w:tcMar>
+              <w:top w:type="dxa" w:w="34"/>
+              <w:left w:type="dxa" w:w="80"/>
+              <w:bottom w:type="dxa" w:w="34"/>
+              <w:right w:type="dxa" w:w="80"/>
+            </w:tcMar>
+            <w:vAlign w:val="center"/>
+          </w:tcPr>
+          <w:p>
+            <w:pPr>
+              <w:spacing w:after="0" w:line="230"/>
+              <w:jc w:val="left"/>
+            </w:pPr>
+            <w:r>
+              <w:rPr>
+                <w:rFonts w:ascii="Calibri" w:cs="Calibri" w:eastAsia="Calibri" w:hAnsi="Calibri"/>
+                <w:b w:val="false"/>
+                <w:bCs w:val="false"/>
+                <w:i w:val="false"/>
+                <w:iCs w:val="false"/>
+                <w:color w:val="222222"/>
+                <w:sz w:val="17"/>
+                <w:szCs w:val="17"/>
+              </w:rPr>
+              <w:t xml:space="preserve">same engine, longer horizon</w:t>
+            </w:r>
+          </w:p>
+        </w:tc>
+        <w:tc>
+          <w:tcPr>
+            <w:shd w:fill="F3F8F8" w:val="clear"/>
+            <w:tcMar>
+              <w:top w:type="dxa" w:w="34"/>
+              <w:left w:type="dxa" w:w="80"/>
+              <w:bottom w:type="dxa" w:w="34"/>
+              <w:right w:type="dxa" w:w="80"/>
+            </w:tcMar>
+            <w:vAlign w:val="center"/>
+          </w:tcPr>
+          <w:p>
+            <w:pPr>
+              <w:spacing w:after="0" w:line="230"/>
+              <w:jc w:val="right"/>
+            </w:pPr>
+            <w:r>
+              <w:rPr>
+                <w:rFonts w:ascii="Calibri" w:cs="Calibri" w:eastAsia="Calibri" w:hAnsi="Calibri"/>
+                <w:b/>
+                <w:bCs/>
+                <w:i w:val="false"/>
+                <w:iCs w:val="false"/>
+                <w:color w:val="222222"/>
+                <w:sz w:val="17"/>
+                <w:szCs w:val="17"/>
+              </w:rPr>
+              <w:t xml:space="preserve">p50 12.24</w:t>
+            </w:r>
+          </w:p>
+        </w:tc>
+        <w:tc>
+          <w:tcPr>
+            <w:shd w:fill="F3F8F8" w:val="clear"/>
+            <w:tcMar>
+              <w:top w:type="dxa" w:w="34"/>
+              <w:left w:type="dxa" w:w="80"/>
+              <w:bottom w:type="dxa" w:w="34"/>
+              <w:right w:type="dxa" w:w="80"/>
+            </w:tcMar>
+            <w:vAlign w:val="center"/>
+          </w:tcPr>
+          <w:p>
+            <w:pPr>
+              <w:spacing w:after="0" w:line="230"/>
+              <w:jc w:val="left"/>
+            </w:pPr>
+            <w:r>
+              <w:rPr>
+                <w:rFonts w:ascii="Calibri" w:cs="Calibri" w:eastAsia="Calibri" w:hAnsi="Calibri"/>
+                <w:b w:val="false"/>
+                <w:bCs w:val="false"/>
+                <w:i w:val="false"/>
+                <w:iCs w:val="false"/>
+                <w:color w:val="222222"/>
+                <w:sz w:val="17"/>
+                <w:szCs w:val="17"/>
+              </w:rPr>
+              <w:t xml:space="preserve">p5 8.64 · p95 17.32 · wide, right-skew</w:t>
+            </w:r>
+          </w:p>
+        </w:tc>
+      </w:tr>
+      <w:tr>
+        <w:tc>
+          <w:tcPr>
+            <w:gridSpan w:val="4"/>
+            <w:shd w:fill="1B5E5E" w:val="clear"/>
+            <w:tcMar>
+              <w:top w:type="dxa" w:w="46"/>
+              <w:left w:type="dxa" w:w="100"/>
+              <w:bottom w:type="dxa" w:w="46"/>
+              <w:right w:type="dxa" w:w="100"/>
+            </w:tcMar>
+          </w:tcPr>
+          <w:p>
+            <w:pPr>
+              <w:spacing w:after="0" w:line="230"/>
+            </w:pPr>
+            <w:r>
+              <w:rPr>
+                <w:rFonts w:ascii="Calibri" w:cs="Calibri" w:eastAsia="Calibri" w:hAnsi="Calibri"/>
+                <w:b/>
+                <w:bCs/>
+                <w:color w:val="FFFFFF"/>
+                <w:sz w:val="17"/>
+                <w:szCs w:val="17"/>
+              </w:rPr>
+              <w:t xml:space="preserve">EXPERT PANEL — three independent methods (Appendix D)</w:t>
+            </w:r>
+          </w:p>
+        </w:tc>
+      </w:tr>
+      <w:tr>
+        <w:tc>
+          <w:tcPr>
+            <w:tcMar>
+              <w:top w:type="dxa" w:w="34"/>
+              <w:left w:type="dxa" w:w="80"/>
+              <w:bottom w:type="dxa" w:w="34"/>
+              <w:right w:type="dxa" w:w="80"/>
+            </w:tcMar>
+            <w:vAlign w:val="center"/>
+          </w:tcPr>
+          <w:p>
+            <w:pPr>
+              <w:spacing w:after="0" w:line="230"/>
+              <w:jc w:val="left"/>
+            </w:pPr>
+            <w:r>
+              <w:rPr>
+                <w:rFonts w:ascii="Calibri" w:cs="Calibri" w:eastAsia="Calibri" w:hAnsi="Calibri"/>
+                <w:b w:val="false"/>
+                <w:bCs w:val="false"/>
+                <w:i w:val="false"/>
+                <w:iCs w:val="false"/>
+                <w:color w:val="222222"/>
+                <w:sz w:val="17"/>
+                <w:szCs w:val="17"/>
+              </w:rPr>
+              <w:t xml:space="preserve">Expert 1 — RNAV realizable</w:t>
+            </w:r>
+          </w:p>
+        </w:tc>
+        <w:tc>
+          <w:tcPr>
+            <w:tcMar>
+              <w:top w:type="dxa" w:w="34"/>
+              <w:left w:type="dxa" w:w="80"/>
+              <w:bottom w:type="dxa" w:w="34"/>
+              <w:right w:type="dxa" w:w="80"/>
+            </w:tcMar>
+            <w:vAlign w:val="center"/>
+          </w:tcPr>
+          <w:p>
+            <w:pPr>
+              <w:spacing w:after="0" w:line="230"/>
+              <w:jc w:val="left"/>
+            </w:pPr>
+            <w:r>
+              <w:rPr>
+                <w:rFonts w:ascii="Calibri" w:cs="Calibri" w:eastAsia="Calibri" w:hAnsi="Calibri"/>
+                <w:b w:val="false"/>
+                <w:bCs w:val="false"/>
+                <w:i w:val="false"/>
+                <w:iCs w:val="false"/>
+                <w:color w:val="222222"/>
+                <w:sz w:val="17"/>
+                <w:szCs w:val="17"/>
+              </w:rPr>
+              <w:t xml:space="preserve">Conservative marks + cash conversion</w:t>
+            </w:r>
+          </w:p>
+        </w:tc>
+        <w:tc>
+          <w:tcPr>
+            <w:tcMar>
+              <w:top w:type="dxa" w:w="34"/>
+              <w:left w:type="dxa" w:w="80"/>
+              <w:bottom w:type="dxa" w:w="34"/>
+              <w:right w:type="dxa" w:w="80"/>
+            </w:tcMar>
+            <w:vAlign w:val="center"/>
+          </w:tcPr>
+          <w:p>
+            <w:pPr>
+              <w:spacing w:after="0" w:line="230"/>
+              <w:jc w:val="right"/>
+            </w:pPr>
+            <w:r>
+              <w:rPr>
+                <w:rFonts w:ascii="Calibri" w:cs="Calibri" w:eastAsia="Calibri" w:hAnsi="Calibri"/>
+                <w:b/>
+                <w:bCs/>
+                <w:i w:val="false"/>
+                <w:iCs w:val="false"/>
+                <w:color w:val="222222"/>
+                <w:sz w:val="17"/>
+                <w:szCs w:val="17"/>
+              </w:rPr>
+              <w:t xml:space="preserve">AED 13.0</w:t>
+            </w:r>
+          </w:p>
+        </w:tc>
+        <w:tc>
+          <w:tcPr>
+            <w:tcMar>
+              <w:top w:type="dxa" w:w="34"/>
+              <w:left w:type="dxa" w:w="80"/>
+              <w:bottom w:type="dxa" w:w="34"/>
+              <w:right w:type="dxa" w:w="80"/>
+            </w:tcMar>
+            <w:vAlign w:val="center"/>
+          </w:tcPr>
+          <w:p>
+            <w:pPr>
+              <w:spacing w:after="0" w:line="230"/>
+              <w:jc w:val="left"/>
+            </w:pPr>
+            <w:r>
+              <w:rPr>
+                <w:rFonts w:ascii="Calibri" w:cs="Calibri" w:eastAsia="Calibri" w:hAnsi="Calibri"/>
+                <w:b w:val="false"/>
+                <w:bCs w:val="false"/>
+                <w:i w:val="false"/>
+                <w:iCs w:val="false"/>
+                <w:color w:val="222222"/>
+                <w:sz w:val="17"/>
+                <w:szCs w:val="17"/>
+              </w:rPr>
+              <w:t xml:space="preserve">The floor</w:t>
+            </w:r>
+          </w:p>
+        </w:tc>
+      </w:tr>
+      <w:tr>
+        <w:tc>
+          <w:tcPr>
+            <w:shd w:fill="F3F8F8" w:val="clear"/>
+            <w:tcMar>
+              <w:top w:type="dxa" w:w="34"/>
+              <w:left w:type="dxa" w:w="80"/>
+              <w:bottom w:type="dxa" w:w="34"/>
+              <w:right w:type="dxa" w:w="80"/>
+            </w:tcMar>
+            <w:vAlign w:val="center"/>
+          </w:tcPr>
+          <w:p>
+            <w:pPr>
+              <w:spacing w:after="0" w:line="230"/>
+              <w:jc w:val="left"/>
+            </w:pPr>
+            <w:r>
+              <w:rPr>
+                <w:rFonts w:ascii="Calibri" w:cs="Calibri" w:eastAsia="Calibri" w:hAnsi="Calibri"/>
+                <w:b w:val="false"/>
+                <w:bCs w:val="false"/>
+                <w:i w:val="false"/>
+                <w:iCs w:val="false"/>
+                <w:color w:val="222222"/>
+                <w:sz w:val="17"/>
+                <w:szCs w:val="17"/>
+              </w:rPr>
+              <w:t xml:space="preserve">Expert 2 — absorption DCF</w:t>
+            </w:r>
+          </w:p>
+        </w:tc>
+        <w:tc>
+          <w:tcPr>
+            <w:shd w:fill="F3F8F8" w:val="clear"/>
+            <w:tcMar>
+              <w:top w:type="dxa" w:w="34"/>
+              <w:left w:type="dxa" w:w="80"/>
+              <w:bottom w:type="dxa" w:w="34"/>
+              <w:right w:type="dxa" w:w="80"/>
+            </w:tcMar>
+            <w:vAlign w:val="center"/>
+          </w:tcPr>
+          <w:p>
+            <w:pPr>
+              <w:spacing w:after="0" w:line="230"/>
+              <w:jc w:val="left"/>
+            </w:pPr>
+            <w:r>
+              <w:rPr>
+                <w:rFonts w:ascii="Calibri" w:cs="Calibri" w:eastAsia="Calibri" w:hAnsi="Calibri"/>
+                <w:b w:val="false"/>
+                <w:bCs w:val="false"/>
+                <w:i w:val="false"/>
+                <w:iCs w:val="false"/>
+                <w:color w:val="222222"/>
+                <w:sz w:val="17"/>
+                <w:szCs w:val="17"/>
+              </w:rPr>
+              <w:t xml:space="preserve">Dubai sales-velocity + backlog re-load</w:t>
+            </w:r>
+          </w:p>
+        </w:tc>
+        <w:tc>
+          <w:tcPr>
+            <w:shd w:fill="F3F8F8" w:val="clear"/>
+            <w:tcMar>
+              <w:top w:type="dxa" w:w="34"/>
+              <w:left w:type="dxa" w:w="80"/>
+              <w:bottom w:type="dxa" w:w="34"/>
+              <w:right w:type="dxa" w:w="80"/>
+            </w:tcMar>
+            <w:vAlign w:val="center"/>
+          </w:tcPr>
+          <w:p>
+            <w:pPr>
+              <w:spacing w:after="0" w:line="230"/>
+              <w:jc w:val="right"/>
+            </w:pPr>
+            <w:r>
+              <w:rPr>
+                <w:rFonts w:ascii="Calibri" w:cs="Calibri" w:eastAsia="Calibri" w:hAnsi="Calibri"/>
+                <w:b/>
+                <w:bCs/>
+                <w:i w:val="false"/>
+                <w:iCs w:val="false"/>
+                <w:color w:val="222222"/>
+                <w:sz w:val="17"/>
+                <w:szCs w:val="17"/>
+              </w:rPr>
+              <w:t xml:space="preserve">AED 16.5</w:t>
+            </w:r>
+          </w:p>
+        </w:tc>
+        <w:tc>
+          <w:tcPr>
+            <w:shd w:fill="F3F8F8" w:val="clear"/>
+            <w:tcMar>
+              <w:top w:type="dxa" w:w="34"/>
+              <w:left w:type="dxa" w:w="80"/>
+              <w:bottom w:type="dxa" w:w="34"/>
+              <w:right w:type="dxa" w:w="80"/>
+            </w:tcMar>
+            <w:vAlign w:val="center"/>
+          </w:tcPr>
+          <w:p>
+            <w:pPr>
+              <w:spacing w:after="0" w:line="230"/>
+              <w:jc w:val="left"/>
+            </w:pPr>
+            <w:r>
+              <w:rPr>
+                <w:rFonts w:ascii="Calibri" w:cs="Calibri" w:eastAsia="Calibri" w:hAnsi="Calibri"/>
+                <w:b w:val="false"/>
+                <w:bCs w:val="false"/>
+                <w:i w:val="false"/>
+                <w:iCs w:val="false"/>
+                <w:color w:val="222222"/>
+                <w:sz w:val="17"/>
+                <w:szCs w:val="17"/>
+              </w:rPr>
+              <w:t xml:space="preserve">Most bullish</w:t>
+            </w:r>
+          </w:p>
+        </w:tc>
+      </w:tr>
+      <w:tr>
+        <w:tc>
+          <w:tcPr>
+            <w:tcMar>
+              <w:top w:type="dxa" w:w="34"/>
+              <w:left w:type="dxa" w:w="80"/>
+              <w:bottom w:type="dxa" w:w="34"/>
+              <w:right w:type="dxa" w:w="80"/>
+            </w:tcMar>
+            <w:vAlign w:val="center"/>
+          </w:tcPr>
+          <w:p>
+            <w:pPr>
+              <w:spacing w:after="0" w:line="230"/>
+              <w:jc w:val="left"/>
+            </w:pPr>
+            <w:r>
+              <w:rPr>
+                <w:rFonts w:ascii="Calibri" w:cs="Calibri" w:eastAsia="Calibri" w:hAnsi="Calibri"/>
+                <w:b w:val="false"/>
+                <w:bCs w:val="false"/>
+                <w:i w:val="false"/>
+                <w:iCs w:val="false"/>
+                <w:color w:val="222222"/>
+                <w:sz w:val="17"/>
+                <w:szCs w:val="17"/>
+              </w:rPr>
+              <w:t xml:space="preserve">Expert 3 — scenario-weighted</w:t>
+            </w:r>
+          </w:p>
+        </w:tc>
+        <w:tc>
+          <w:tcPr>
+            <w:tcMar>
+              <w:top w:type="dxa" w:w="34"/>
+              <w:left w:type="dxa" w:w="80"/>
+              <w:bottom w:type="dxa" w:w="34"/>
+              <w:right w:type="dxa" w:w="80"/>
+            </w:tcMar>
+            <w:vAlign w:val="center"/>
+          </w:tcPr>
+          <w:p>
+            <w:pPr>
+              <w:spacing w:after="0" w:line="230"/>
+              <w:jc w:val="left"/>
+            </w:pPr>
+            <w:r>
+              <w:rPr>
+                <w:rFonts w:ascii="Calibri" w:cs="Calibri" w:eastAsia="Calibri" w:hAnsi="Calibri"/>
+                <w:b w:val="false"/>
+                <w:bCs w:val="false"/>
+                <w:i w:val="false"/>
+                <w:iCs w:val="false"/>
+                <w:color w:val="222222"/>
+                <w:sz w:val="17"/>
+                <w:szCs w:val="17"/>
+              </w:rPr>
+              <w:t xml:space="preserve">Fed path · Dubai cycle · EGP weights</w:t>
+            </w:r>
+          </w:p>
+        </w:tc>
+        <w:tc>
+          <w:tcPr>
+            <w:tcMar>
+              <w:top w:type="dxa" w:w="34"/>
+              <w:left w:type="dxa" w:w="80"/>
+              <w:bottom w:type="dxa" w:w="34"/>
+              <w:right w:type="dxa" w:w="80"/>
+            </w:tcMar>
+            <w:vAlign w:val="center"/>
+          </w:tcPr>
+          <w:p>
+            <w:pPr>
+              <w:spacing w:after="0" w:line="230"/>
+              <w:jc w:val="right"/>
+            </w:pPr>
+            <w:r>
+              <w:rPr>
+                <w:rFonts w:ascii="Calibri" w:cs="Calibri" w:eastAsia="Calibri" w:hAnsi="Calibri"/>
+                <w:b/>
+                <w:bCs/>
+                <w:i w:val="false"/>
+                <w:iCs w:val="false"/>
+                <w:color w:val="222222"/>
+                <w:sz w:val="17"/>
+                <w:szCs w:val="17"/>
+              </w:rPr>
+              <w:t xml:space="preserve">AED 14.0</w:t>
+            </w:r>
+          </w:p>
+        </w:tc>
+        <w:tc>
+          <w:tcPr>
+            <w:tcMar>
+              <w:top w:type="dxa" w:w="34"/>
+              <w:left w:type="dxa" w:w="80"/>
+              <w:bottom w:type="dxa" w:w="34"/>
+              <w:right w:type="dxa" w:w="80"/>
+            </w:tcMar>
+            <w:vAlign w:val="center"/>
+          </w:tcPr>
+          <w:p>
+            <w:pPr>
+              <w:spacing w:after="0" w:line="230"/>
+              <w:jc w:val="left"/>
+            </w:pPr>
+            <w:r>
+              <w:rPr>
+                <w:rFonts w:ascii="Calibri" w:cs="Calibri" w:eastAsia="Calibri" w:hAnsi="Calibri"/>
+                <w:b w:val="false"/>
+                <w:bCs w:val="false"/>
+                <w:i w:val="false"/>
+                <w:iCs w:val="false"/>
+                <w:color w:val="222222"/>
+                <w:sz w:val="17"/>
+                <w:szCs w:val="17"/>
+              </w:rPr>
+              <w:t xml:space="preserve">The middle</w:t>
+            </w:r>
+          </w:p>
+        </w:tc>
+      </w:tr>
+      <w:tr>
+        <w:tc>
+          <w:tcPr>
+            <w:shd w:fill="F3F8F8" w:val="clear"/>
+            <w:tcMar>
+              <w:top w:type="dxa" w:w="34"/>
+              <w:left w:type="dxa" w:w="80"/>
+              <w:bottom w:type="dxa" w:w="34"/>
+              <w:right w:type="dxa" w:w="80"/>
+            </w:tcMar>
+            <w:vAlign w:val="center"/>
+          </w:tcPr>
+          <w:p>
+            <w:pPr>
+              <w:spacing w:after="0" w:line="230"/>
+              <w:jc w:val="left"/>
+            </w:pPr>
+            <w:r>
+              <w:rPr>
+                <w:rFonts w:ascii="Calibri" w:cs="Calibri" w:eastAsia="Calibri" w:hAnsi="Calibri"/>
+                <w:b/>
+                <w:bCs/>
+                <w:i w:val="false"/>
+                <w:iCs w:val="false"/>
+                <w:color w:val="222222"/>
+                <w:sz w:val="17"/>
+                <w:szCs w:val="17"/>
+              </w:rPr>
+              <w:t xml:space="preserve">Panel range</w:t>
+            </w:r>
+          </w:p>
+        </w:tc>
+        <w:tc>
+          <w:tcPr>
+            <w:shd w:fill="F3F8F8" w:val="clear"/>
+            <w:tcMar>
+              <w:top w:type="dxa" w:w="34"/>
+              <w:left w:type="dxa" w:w="80"/>
+              <w:bottom w:type="dxa" w:w="34"/>
+              <w:right w:type="dxa" w:w="80"/>
+            </w:tcMar>
+            <w:vAlign w:val="center"/>
+          </w:tcPr>
+          <w:p>
+            <w:pPr>
+              <w:spacing w:after="0" w:line="230"/>
+              <w:jc w:val="left"/>
+            </w:pPr>
+            <w:r>
+              <w:rPr>
+                <w:rFonts w:ascii="Calibri" w:cs="Calibri" w:eastAsia="Calibri" w:hAnsi="Calibri"/>
+                <w:b w:val="false"/>
+                <w:bCs w:val="false"/>
+                <w:i w:val="false"/>
+                <w:iCs w:val="false"/>
+                <w:color w:val="222222"/>
+                <w:sz w:val="17"/>
+                <w:szCs w:val="17"/>
+              </w:rPr>
+              <w:t xml:space="preserve">Spread = the NAV-discount question</w:t>
+            </w:r>
+          </w:p>
+        </w:tc>
+        <w:tc>
+          <w:tcPr>
+            <w:shd w:fill="F3F8F8" w:val="clear"/>
+            <w:tcMar>
+              <w:top w:type="dxa" w:w="34"/>
+              <w:left w:type="dxa" w:w="80"/>
+              <w:bottom w:type="dxa" w:w="34"/>
+              <w:right w:type="dxa" w:w="80"/>
+            </w:tcMar>
+            <w:vAlign w:val="center"/>
+          </w:tcPr>
+          <w:p>
+            <w:pPr>
+              <w:spacing w:after="0" w:line="230"/>
+              <w:jc w:val="right"/>
+            </w:pPr>
+            <w:r>
+              <w:rPr>
+                <w:rFonts w:ascii="Calibri" w:cs="Calibri" w:eastAsia="Calibri" w:hAnsi="Calibri"/>
+                <w:b/>
+                <w:bCs/>
+                <w:i w:val="false"/>
+                <w:iCs w:val="false"/>
+                <w:color w:val="222222"/>
+                <w:sz w:val="17"/>
+                <w:szCs w:val="17"/>
+              </w:rPr>
+              <w:t xml:space="preserve">AED 13.0–16.5</w:t>
+            </w:r>
+          </w:p>
+        </w:tc>
+        <w:tc>
+          <w:tcPr>
+            <w:shd w:fill="F3F8F8" w:val="clear"/>
+            <w:tcMar>
+              <w:top w:type="dxa" w:w="34"/>
+              <w:left w:type="dxa" w:w="80"/>
+              <w:bottom w:type="dxa" w:w="34"/>
+              <w:right w:type="dxa" w:w="80"/>
+            </w:tcMar>
+            <w:vAlign w:val="center"/>
+          </w:tcPr>
+          <w:p>
+            <w:pPr>
+              <w:spacing w:after="0" w:line="230"/>
+              <w:jc w:val="left"/>
+            </w:pPr>
+            <w:r>
+              <w:rPr>
+                <w:rFonts w:ascii="Calibri" w:cs="Calibri" w:eastAsia="Calibri" w:hAnsi="Calibri"/>
+                <w:b/>
+                <w:bCs/>
+                <w:i w:val="false"/>
+                <w:iCs w:val="false"/>
+                <w:color w:val="222222"/>
+                <w:sz w:val="17"/>
+                <w:szCs w:val="17"/>
+              </w:rPr>
+              <w:t xml:space="preserve">Centres ~AED 14.5</w:t>
+            </w:r>
+          </w:p>
+        </w:tc>
+      </w:tr>
+    </w:tbl>
+    <w:p>
+      <w:pPr>
+        <w:spacing w:after="120" w:before="60" w:line="264"/>
+      </w:pPr>
+      <w:r>
+        <w:rPr>
+          <w:rFonts w:ascii="Calibri" w:cs="Calibri" w:eastAsia="Calibri" w:hAnsi="Calibri"/>
+          <w:b/>
+          <w:bCs/>
+          <w:i w:val="false"/>
+          <w:iCs w:val="false"/>
+          <w:color w:val="222222"/>
+          <w:sz w:val="20"/>
+          <w:szCs w:val="20"/>
+        </w:rPr>
+        <w:t xml:space="preserve">Bottom line.</w:t>
+      </w:r>
+      <w:r>
+        <w:rPr>
+          <w:rFonts w:ascii="Calibri" w:cs="Calibri" w:eastAsia="Calibri" w:hAnsi="Calibri"/>
+          <w:b w:val="false"/>
+          <w:bCs w:val="false"/>
+          <w:i w:val="false"/>
+          <w:iCs w:val="false"/>
+          <w:color w:val="222222"/>
+          <w:sz w:val="20"/>
+          <w:szCs w:val="20"/>
+        </w:rPr>
+        <w:t xml:space="preserve">  Every fundamental read points the same way — Emaar's operating businesses and marked assets are worth more than the price — and the reads disagree only on how much the market will discount the sum of the parts. The four lenses cluster at AED 14.12–15.53 for a central near AED 14.80, about 22% above the AED 12.14 spot; the three experts span AED 13.0–16.5 at base, and each turns on a single question: the multiple the market pays for the recurring mall-and-hotel portfolio and how narrow the NAV/conglomerate discount will be. Only the deep-bear case — a wide discount held through a Dubai rollover — sits below spot. The technical tape is the lone near-neutral read, consolidating after a ~29% correction with momentum turning up, which is why the three-month distribution centres near spot with a wide, right-skewed band rather than already at fundamental value.</w:t>
       </w:r>
     </w:p>
     <w:p>

</xml_diff>